<commit_message>
logboeken bijgewerkt + rapport screenshot
</commit_message>
<xml_diff>
--- a/Rapport/Het Rapport.docx
+++ b/Rapport/Het Rapport.docx
@@ -16971,14 +16971,21 @@
           <w:rFonts w:ascii="Arial" w:hAnsi="Arial" w:cs="Arial"/>
           <w:lang w:val="nl-NL"/>
         </w:rPr>
-        <w:t xml:space="preserve"> (Bezocht: 10</w:t>
-      </w:r>
-      <w:r>
-        <w:rPr>
-          <w:rFonts w:ascii="Arial" w:hAnsi="Arial" w:cs="Arial"/>
-          <w:lang w:val="nl-NL"/>
-        </w:rPr>
-        <w:t>-05-2012)</w:t>
+        <w:t xml:space="preserve"> (Bezocht: </w:t>
+      </w:r>
+      <w:r>
+        <w:rPr>
+          <w:rFonts w:ascii="Arial" w:hAnsi="Arial" w:cs="Arial"/>
+          <w:lang w:val="nl-NL"/>
+        </w:rPr>
+        <w:t>20-04</w:t>
+      </w:r>
+      <w:r>
+        <w:rPr>
+          <w:rFonts w:ascii="Arial" w:hAnsi="Arial" w:cs="Arial"/>
+          <w:lang w:val="nl-NL"/>
+        </w:rPr>
+        <w:t>-2012)</w:t>
       </w:r>
     </w:p>
     <w:p>
@@ -17018,14 +17025,14 @@
           <w:rFonts w:ascii="Arial" w:hAnsi="Arial" w:cs="Arial"/>
           <w:lang w:val="nl-NL"/>
         </w:rPr>
-        <w:t>11</w:t>
-      </w:r>
-      <w:r>
-        <w:rPr>
-          <w:rFonts w:ascii="Arial" w:hAnsi="Arial" w:cs="Arial"/>
-          <w:lang w:val="nl-NL"/>
-        </w:rPr>
-        <w:t>-05-2012)</w:t>
+        <w:t>20-04</w:t>
+      </w:r>
+      <w:r>
+        <w:rPr>
+          <w:rFonts w:ascii="Arial" w:hAnsi="Arial" w:cs="Arial"/>
+          <w:lang w:val="nl-NL"/>
+        </w:rPr>
+        <w:t>-2012)</w:t>
       </w:r>
     </w:p>
     <w:p>
@@ -17065,14 +17072,14 @@
           <w:rFonts w:ascii="Arial" w:hAnsi="Arial" w:cs="Arial"/>
           <w:lang w:val="nl-NL"/>
         </w:rPr>
-        <w:t>11</w:t>
-      </w:r>
-      <w:r>
-        <w:rPr>
-          <w:rFonts w:ascii="Arial" w:hAnsi="Arial" w:cs="Arial"/>
-          <w:lang w:val="nl-NL"/>
-        </w:rPr>
-        <w:t>-05-2012)</w:t>
+        <w:t>20-04</w:t>
+      </w:r>
+      <w:r>
+        <w:rPr>
+          <w:rFonts w:ascii="Arial" w:hAnsi="Arial" w:cs="Arial"/>
+          <w:lang w:val="nl-NL"/>
+        </w:rPr>
+        <w:t>-2012)</w:t>
       </w:r>
     </w:p>
     <w:p>
@@ -17112,14 +17119,28 @@
           <w:rFonts w:ascii="Arial" w:hAnsi="Arial" w:cs="Arial"/>
           <w:lang w:val="nl-NL"/>
         </w:rPr>
-        <w:t>14</w:t>
-      </w:r>
-      <w:r>
-        <w:rPr>
-          <w:rFonts w:ascii="Arial" w:hAnsi="Arial" w:cs="Arial"/>
-          <w:lang w:val="nl-NL"/>
-        </w:rPr>
-        <w:t>-05-2012)</w:t>
+        <w:t>18</w:t>
+      </w:r>
+      <w:r>
+        <w:rPr>
+          <w:rFonts w:ascii="Arial" w:hAnsi="Arial" w:cs="Arial"/>
+          <w:lang w:val="nl-NL"/>
+        </w:rPr>
+        <w:t>-</w:t>
+      </w:r>
+      <w:r>
+        <w:rPr>
+          <w:rFonts w:ascii="Arial" w:hAnsi="Arial" w:cs="Arial"/>
+          <w:lang w:val="nl-NL"/>
+        </w:rPr>
+        <w:t>04</w:t>
+      </w:r>
+      <w:r>
+        <w:rPr>
+          <w:rFonts w:ascii="Arial" w:hAnsi="Arial" w:cs="Arial"/>
+          <w:lang w:val="nl-NL"/>
+        </w:rPr>
+        <w:t>-2012)</w:t>
       </w:r>
     </w:p>
     <w:p>
@@ -17159,14 +17180,14 @@
           <w:rFonts w:ascii="Arial" w:hAnsi="Arial" w:cs="Arial"/>
           <w:lang w:val="nl-NL"/>
         </w:rPr>
-        <w:t>15</w:t>
-      </w:r>
-      <w:r>
-        <w:rPr>
-          <w:rFonts w:ascii="Arial" w:hAnsi="Arial" w:cs="Arial"/>
-          <w:lang w:val="nl-NL"/>
-        </w:rPr>
-        <w:t>-05-2012)</w:t>
+        <w:t>27-04</w:t>
+      </w:r>
+      <w:r>
+        <w:rPr>
+          <w:rFonts w:ascii="Arial" w:hAnsi="Arial" w:cs="Arial"/>
+          <w:lang w:val="nl-NL"/>
+        </w:rPr>
+        <w:t>-2012)</w:t>
       </w:r>
     </w:p>
     <w:p>
@@ -17206,14 +17227,14 @@
           <w:rFonts w:ascii="Arial" w:hAnsi="Arial" w:cs="Arial"/>
           <w:lang w:val="nl-NL"/>
         </w:rPr>
-        <w:t>15</w:t>
-      </w:r>
-      <w:r>
-        <w:rPr>
-          <w:rFonts w:ascii="Arial" w:hAnsi="Arial" w:cs="Arial"/>
-          <w:lang w:val="nl-NL"/>
-        </w:rPr>
-        <w:t>-05-2012)</w:t>
+        <w:t>27-04</w:t>
+      </w:r>
+      <w:r>
+        <w:rPr>
+          <w:rFonts w:ascii="Arial" w:hAnsi="Arial" w:cs="Arial"/>
+          <w:lang w:val="nl-NL"/>
+        </w:rPr>
+        <w:t>-2012)</w:t>
       </w:r>
     </w:p>
     <w:p>
@@ -17253,7 +17274,7 @@
           <w:rFonts w:ascii="Arial" w:hAnsi="Arial" w:cs="Arial"/>
           <w:lang w:val="nl-NL"/>
         </w:rPr>
-        <w:t>18</w:t>
+        <w:t>08</w:t>
       </w:r>
       <w:r>
         <w:rPr>
@@ -17300,7 +17321,7 @@
           <w:rFonts w:ascii="Arial" w:hAnsi="Arial" w:cs="Arial"/>
           <w:lang w:val="nl-NL"/>
         </w:rPr>
-        <w:t>19</w:t>
+        <w:t>09</w:t>
       </w:r>
       <w:r>
         <w:rPr>
@@ -17309,16 +17330,16 @@
         </w:rPr>
         <w:t>-05-2012)</w:t>
       </w:r>
-    </w:p>
-    <w:p>
-      <w:pPr>
-        <w:rPr>
-          <w:rFonts w:ascii="Arial" w:hAnsi="Arial" w:cs="Arial"/>
-          <w:lang w:val="nl-NL"/>
-        </w:rPr>
-      </w:pPr>
       <w:bookmarkStart w:id="41" w:name="_GoBack"/>
       <w:bookmarkEnd w:id="41"/>
+    </w:p>
+    <w:p>
+      <w:pPr>
+        <w:rPr>
+          <w:rFonts w:ascii="Arial" w:hAnsi="Arial" w:cs="Arial"/>
+          <w:lang w:val="nl-NL"/>
+        </w:rPr>
+      </w:pPr>
     </w:p>
     <w:p>
       <w:pPr>
@@ -22041,7 +22062,7 @@
 </file>
 
 <file path=customXml/itemProps1.xml><?xml version="1.0" encoding="utf-8"?>
-<ds:datastoreItem xmlns:ds="http://schemas.openxmlformats.org/officeDocument/2006/customXml" ds:itemID="{EB9D7788-0EB6-BF4A-805B-A3B07D5671AA}">
+<ds:datastoreItem xmlns:ds="http://schemas.openxmlformats.org/officeDocument/2006/customXml" ds:itemID="{0FDCD8DD-9FEE-7845-AA23-A2381C4C988E}">
   <ds:schemaRefs>
     <ds:schemaRef ds:uri="http://schemas.openxmlformats.org/officeDocument/2006/bibliography"/>
   </ds:schemaRefs>

</xml_diff>